<commit_message>
Soften Book 16 KSI completion claims to self-assessment language
Add a prominent callout box noting all KSI verdicts are self-assessed
and require independent 3PAO validation before ATO. Update the section
heading, table caption, summary sentence, POA&M status text, AO checklist
item, and Appendix A intro to consistently use "evaluated at high
confidence, pending 3PAO validation" rather than absolute "satisfied"
claims. Rebuild docx and ZIP.

Co-Authored-By: Claude Sonnet 4.6 <noreply@anthropic.com>
Claude-Session: https://claude.ai/code/session_018ARKuNwxjq36Y7DP2uE94c
</commit_message>
<xml_diff>
--- a/inbox/Application Aware Networking/Book_16_Federal_Application_Aware_Networking_Authorization_Package_ConMon.docx
+++ b/inbox/Application Aware Networking/Book_16_Federal_Application_Aware_Networking_Authorization_Package_ConMon.docx
@@ -166,46 +166,11 @@
         <w:t xml:space="preserve">2026</w:t>
       </w:r>
     </w:p>
-    <w:sdt>
-      <w:sdtPr>
-        <w:docPartObj>
-          <w:docPartGallery w:val="Table of Contents"/>
-          <w:docPartUnique/>
-        </w:docPartObj>
-      </w:sdtPr>
-      <w:sdtContent>
-        <w:p>
-          <w:pPr>
-            <w:pStyle w:val="TOCHeading"/>
-          </w:pPr>
-          <w:r>
-            <w:t xml:space="preserve">Table of Contents</w:t>
-          </w:r>
-        </w:p>
-        <w:p>
-          <w:r>
-            <w:fldChar w:fldCharType="begin" w:dirty="true"/>
-            <w:instrText xml:space="preserve">TOC \o "1-3" \h \z \u</w:instrText>
-            <w:fldChar w:fldCharType="separate"/>
-            <w:fldChar w:fldCharType="end"/>
-          </w:r>
-        </w:p>
-      </w:sdtContent>
-    </w:sdt>
     <w:bookmarkStart w:id="20" w:name="preface"/>
     <w:p>
       <w:pPr>
         <w:pStyle w:val="Heading1"/>
       </w:pPr>
-      <w:r>
-        <w:rPr>
-          <w:rStyle w:val="SectionNumber"/>
-        </w:rPr>
-        <w:t xml:space="preserve">1</w:t>
-      </w:r>
-      <w:r>
-        <w:tab/>
-      </w:r>
       <w:r>
         <w:t xml:space="preserve">Preface</w:t>
       </w:r>
@@ -396,22 +361,13 @@
       </w:r>
     </w:p>
     <w:bookmarkEnd w:id="20"/>
-    <w:bookmarkStart w:id="26" w:name="Xd9fc1c7df60973c65cbb922ab6cb1e3c193887a"/>
+    <w:bookmarkStart w:id="26" w:name="X6c72c1f57fd8a4e2f7c09fcb24e856174ef11fb"/>
     <w:p>
       <w:pPr>
         <w:pStyle w:val="Heading1"/>
       </w:pPr>
       <w:r>
-        <w:rPr>
-          <w:rStyle w:val="SectionNumber"/>
-        </w:rPr>
-        <w:t xml:space="preserve">2</w:t>
-      </w:r>
-      <w:r>
-        <w:tab/>
-      </w:r>
-      <w:r>
-        <w:t xml:space="preserve">1 The Fifteen-Book Journey — All 29 KSIs Green</w:t>
+        <w:t xml:space="preserve">1 The Fifteen-Book Journey — All 29 KSIs Evaluable at High Confidence</w:t>
       </w:r>
     </w:p>
     <w:bookmarkStart w:id="21" w:name="series-summary"/>
@@ -419,15 +375,6 @@
       <w:pPr>
         <w:pStyle w:val="Heading2"/>
       </w:pPr>
-      <w:r>
-        <w:rPr>
-          <w:rStyle w:val="SectionNumber"/>
-        </w:rPr>
-        <w:t xml:space="preserve">2.1</w:t>
-      </w:r>
-      <w:r>
-        <w:tab/>
-      </w:r>
       <w:r>
         <w:t xml:space="preserve">1.1 Series Summary</w:t>
       </w:r>
@@ -465,13 +412,13 @@
         <w:t xml:space="preserve"> </w:t>
       </w:r>
       <w:r>
-        <w:t xml:space="preserve">and activates</w:t>
-      </w:r>
-      <w:r>
-        <w:t xml:space="preserve"> </w:t>
-      </w:r>
-      <w:r>
-        <w:t xml:space="preserve">all</w:t>
+        <w:t xml:space="preserve">and provides</w:t>
+      </w:r>
+      <w:r>
+        <w:t xml:space="preserve"> </w:t>
+      </w:r>
+      <w:r>
+        <w:t xml:space="preserve">self-assessed evidence for all</w:t>
       </w:r>
       <w:r>
         <w:t xml:space="preserve"> </w:t>
@@ -485,6 +432,48 @@
       </w:r>
       <w:r>
         <w:t xml:space="preserve">.</w:t>
+      </w:r>
+    </w:p>
+    <w:p>
+      <w:pPr>
+        <w:pStyle w:val="BodyText"/>
+      </w:pPr>
+      <w:r>
+        <w:rPr>
+          <w:bCs/>
+          <w:b/>
+        </w:rPr>
+        <w:t xml:space="preserve">Self-Assessment Notice.</w:t>
+      </w:r>
+      <w:r>
+        <w:t xml:space="preserve"> </w:t>
+      </w:r>
+      <w:r>
+        <w:t xml:space="preserve">All KSI verdicts in this document are produced by</w:t>
+      </w:r>
+      <w:r>
+        <w:t xml:space="preserve"> </w:t>
+      </w:r>
+      <w:r>
+        <w:t xml:space="preserve">the UIAO Conformance Adapter — an automated self-assessment tool. They are</w:t>
+      </w:r>
+      <w:r>
+        <w:t xml:space="preserve"> </w:t>
+      </w:r>
+      <w:r>
+        <w:t xml:space="preserve">advisory and do not constitute a formal authorization. Results must be</w:t>
+      </w:r>
+      <w:r>
+        <w:t xml:space="preserve"> </w:t>
+      </w:r>
+      <w:r>
+        <w:t xml:space="preserve">independently validated by a FedRAMP-recognized 3PAO and accepted by the</w:t>
+      </w:r>
+      <w:r>
+        <w:t xml:space="preserve"> </w:t>
+      </w:r>
+      <w:r>
+        <w:t xml:space="preserve">Agency Authorizing Official before an ATO is granted.</w:t>
       </w:r>
     </w:p>
     <w:p>
@@ -1127,15 +1116,6 @@
         <w:pStyle w:val="Heading2"/>
       </w:pPr>
       <w:r>
-        <w:rPr>
-          <w:rStyle w:val="SectionNumber"/>
-        </w:rPr>
-        <w:t xml:space="preserve">2.2</w:t>
-      </w:r>
-      <w:r>
-        <w:tab/>
-      </w:r>
-      <w:r>
         <w:t xml:space="preserve">1.2 KSI Scorecard</w:t>
       </w:r>
     </w:p>
@@ -1150,7 +1130,7 @@
         <w:t xml:space="preserve"> </w:t>
       </w:r>
       <w:r>
-        <w:t xml:space="preserve">AAN slot evidence. As of July 4, 2026:</w:t>
+        <w:t xml:space="preserve">AAN slot evidence. As of July 4, 2026 (self-assessment — pending 3PAO validation):</w:t>
       </w:r>
     </w:p>
     <w:p>
@@ -1158,7 +1138,7 @@
         <w:pStyle w:val="TableCaption"/>
       </w:pPr>
       <w:r>
-        <w:t xml:space="preserve">KSI Evaluation Summary — 29/29 Satisfied {.striped .hover}</w:t>
+        <w:t xml:space="preserve">KSI Evaluation Summary — 29/29 Evaluable at High Confidence (Self-Assessed) {.striped .hover}</w:t>
       </w:r>
     </w:p>
     <w:tbl>
@@ -1167,7 +1147,7 @@
         <w:tblW w:type="pct" w:w="5000"/>
         <w:tblLook w:firstRow="1" w:lastRow="0" w:firstColumn="0" w:lastColumn="0" w:noHBand="0" w:noVBand="0" w:val="0020"/>
         <w:jc w:val="start"/>
-        <w:tblCaption w:val="KSI Evaluation Summary — 29/29 Satisfied {.striped .hover}"/>
+        <w:tblCaption w:val="KSI Evaluation Summary — 29/29 Evaluable at High Confidence (Self-Assessed) {.striped .hover}"/>
       </w:tblPr>
       <w:tblGrid>
         <w:gridCol w:w="3090"/>
@@ -1392,13 +1372,25 @@
         <w:pStyle w:val="BodyText"/>
       </w:pPr>
       <w:r>
-        <w:t xml:space="preserve">All 29 CR26 KSIs satisfied. Zero open risks. Zero POA&amp;M items. The OSCAL</w:t>
-      </w:r>
-      <w:r>
-        <w:t xml:space="preserve"> </w:t>
-      </w:r>
-      <w:r>
-        <w:t xml:space="preserve">Assessment Results (AR) document is the machine-readable CA-2 deliverable.</w:t>
+        <w:t xml:space="preserve">All 29 CR26 KSIs evaluated at high confidence in the current self-assessment run.</w:t>
+      </w:r>
+      <w:r>
+        <w:t xml:space="preserve"> </w:t>
+      </w:r>
+      <w:r>
+        <w:t xml:space="preserve">Zero open risks identified. Zero POA&amp;M items generated. These results are</w:t>
+      </w:r>
+      <w:r>
+        <w:t xml:space="preserve"> </w:t>
+      </w:r>
+      <w:r>
+        <w:t xml:space="preserve">advisory pending independent 3PAO validation. The OSCAL Assessment Results (AR)</w:t>
+      </w:r>
+      <w:r>
+        <w:t xml:space="preserve"> </w:t>
+      </w:r>
+      <w:r>
+        <w:t xml:space="preserve">document is the machine-readable CA-2 deliverable.</w:t>
       </w:r>
     </w:p>
     <w:p>
@@ -1408,7 +1400,7 @@
       <w:r>
         <w:drawing>
           <wp:inline>
-            <wp:extent cx="7772400" cy="3886200"/>
+            <wp:extent cx="5334000" cy="2667000"/>
             <wp:effectExtent b="0" l="0" r="0" t="0"/>
             <wp:docPr descr="FedRAMP 20x Authorization Package Structure" title="" id="23" name="Picture"/>
             <a:graphic>
@@ -1429,7 +1421,7 @@
                   <pic:spPr bwMode="auto">
                     <a:xfrm>
                       <a:off x="0" y="0"/>
-                      <a:ext cx="7772400" cy="3886200"/>
+                      <a:ext cx="5334000" cy="2667000"/>
                     </a:xfrm>
                     <a:prstGeom prst="rect">
                       <a:avLst/>
@@ -1471,15 +1463,6 @@
         <w:pStyle w:val="Heading1"/>
       </w:pPr>
       <w:r>
-        <w:rPr>
-          <w:rStyle w:val="SectionNumber"/>
-        </w:rPr>
-        <w:t xml:space="preserve">3</w:t>
-      </w:r>
-      <w:r>
-        <w:tab/>
-      </w:r>
-      <w:r>
         <w:t xml:space="preserve">2 OSCAL Bundle — Machine-Readable KSI Evidence (CA-2, CA-5)</w:t>
       </w:r>
     </w:p>
@@ -1488,15 +1471,6 @@
       <w:pPr>
         <w:pStyle w:val="Heading2"/>
       </w:pPr>
-      <w:r>
-        <w:rPr>
-          <w:rStyle w:val="SectionNumber"/>
-        </w:rPr>
-        <w:t xml:space="preserve">3.1</w:t>
-      </w:r>
-      <w:r>
-        <w:tab/>
-      </w:r>
       <w:r>
         <w:t xml:space="preserve">2.1 Bundle Architecture</w:t>
       </w:r>
@@ -1843,15 +1817,6 @@
         <w:pStyle w:val="Heading2"/>
       </w:pPr>
       <w:r>
-        <w:rPr>
-          <w:rStyle w:val="SectionNumber"/>
-        </w:rPr>
-        <w:t xml:space="preserve">3.2</w:t>
-      </w:r>
-      <w:r>
-        <w:tab/>
-      </w:r>
-      <w:r>
         <w:t xml:space="preserve">2.2 Generating the Bundle</w:t>
       </w:r>
     </w:p>
@@ -2015,15 +1980,6 @@
       <w:pPr>
         <w:pStyle w:val="Heading2"/>
       </w:pPr>
-      <w:r>
-        <w:rPr>
-          <w:rStyle w:val="SectionNumber"/>
-        </w:rPr>
-        <w:t xml:space="preserve">3.3</w:t>
-      </w:r>
-      <w:r>
-        <w:tab/>
-      </w:r>
       <w:r>
         <w:t xml:space="preserve">2.3 Assessment Plan Structure</w:t>
       </w:r>
@@ -2486,15 +2442,6 @@
         <w:pStyle w:val="Heading2"/>
       </w:pPr>
       <w:r>
-        <w:rPr>
-          <w:rStyle w:val="SectionNumber"/>
-        </w:rPr>
-        <w:t xml:space="preserve">3.4</w:t>
-      </w:r>
-      <w:r>
-        <w:tab/>
-      </w:r>
-      <w:r>
         <w:t xml:space="preserve">2.4 Assessment Results — Finding Structure</w:t>
       </w:r>
     </w:p>
@@ -2724,15 +2671,6 @@
         <w:pStyle w:val="Heading2"/>
       </w:pPr>
       <w:r>
-        <w:rPr>
-          <w:rStyle w:val="SectionNumber"/>
-        </w:rPr>
-        <w:t xml:space="preserve">3.5</w:t>
-      </w:r>
-      <w:r>
-        <w:tab/>
-      </w:r>
-      <w:r>
         <w:t xml:space="preserve">2.5 POA&amp;M Status</w:t>
       </w:r>
     </w:p>
@@ -2796,13 +2734,13 @@
         <w:pStyle w:val="FirstParagraph"/>
       </w:pPr>
       <w:r>
-        <w:t xml:space="preserve">A zero-item POA&amp;M is the correct target state — it means all required controls</w:t>
-      </w:r>
-      <w:r>
-        <w:t xml:space="preserve"> </w:t>
-      </w:r>
-      <w:r>
-        <w:t xml:space="preserve">are demonstrably satisfied. The POA&amp;M will be regenerated after each assessment</w:t>
+        <w:t xml:space="preserve">A zero-item POA&amp;M is the correct target state for the self-assessment — it means</w:t>
+      </w:r>
+      <w:r>
+        <w:t xml:space="preserve"> </w:t>
+      </w:r>
+      <w:r>
+        <w:t xml:space="preserve">all required controls are assessed as satisfied in the current adapter run. The POA&amp;M will be regenerated after each assessment</w:t>
       </w:r>
       <w:r>
         <w:t xml:space="preserve"> </w:t>
@@ -2847,15 +2785,6 @@
         <w:pStyle w:val="Heading1"/>
       </w:pPr>
       <w:r>
-        <w:rPr>
-          <w:rStyle w:val="SectionNumber"/>
-        </w:rPr>
-        <w:t xml:space="preserve">4</w:t>
-      </w:r>
-      <w:r>
-        <w:tab/>
-      </w:r>
-      <w:r>
         <w:t xml:space="preserve">3 Continuous Monitoring Program (CA-7)</w:t>
       </w:r>
     </w:p>
@@ -2864,15 +2793,6 @@
       <w:pPr>
         <w:pStyle w:val="Heading2"/>
       </w:pPr>
-      <w:r>
-        <w:rPr>
-          <w:rStyle w:val="SectionNumber"/>
-        </w:rPr>
-        <w:t xml:space="preserve">4.1</w:t>
-      </w:r>
-      <w:r>
-        <w:tab/>
-      </w:r>
       <w:r>
         <w:t xml:space="preserve">3.1 ConMon Framework</w:t>
       </w:r>
@@ -2960,7 +2880,7 @@
       <w:r>
         <w:drawing>
           <wp:inline>
-            <wp:extent cx="7772400" cy="3138853"/>
+            <wp:extent cx="5334000" cy="2154115"/>
             <wp:effectExtent b="0" l="0" r="0" t="0"/>
             <wp:docPr descr="Continuous Monitoring Calendar — Annual Cadence" title="" id="34" name="Picture"/>
             <a:graphic>
@@ -2981,7 +2901,7 @@
                   <pic:spPr bwMode="auto">
                     <a:xfrm>
                       <a:off x="0" y="0"/>
-                      <a:ext cx="7772400" cy="3138853"/>
+                      <a:ext cx="5334000" cy="2154115"/>
                     </a:xfrm>
                     <a:prstGeom prst="rect">
                       <a:avLst/>
@@ -3015,15 +2935,6 @@
         <w:pStyle w:val="Heading2"/>
       </w:pPr>
       <w:r>
-        <w:rPr>
-          <w:rStyle w:val="SectionNumber"/>
-        </w:rPr>
-        <w:t xml:space="preserve">4.2</w:t>
-      </w:r>
-      <w:r>
-        <w:tab/>
-      </w:r>
-      <w:r>
         <w:t xml:space="preserve">3.2 Monthly ConMon Activities</w:t>
       </w:r>
     </w:p>
@@ -3434,15 +3345,6 @@
         <w:pStyle w:val="Heading2"/>
       </w:pPr>
       <w:r>
-        <w:rPr>
-          <w:rStyle w:val="SectionNumber"/>
-        </w:rPr>
-        <w:t xml:space="preserve">4.3</w:t>
-      </w:r>
-      <w:r>
-        <w:tab/>
-      </w:r>
-      <w:r>
         <w:t xml:space="preserve">3.3 Quarterly Activities</w:t>
       </w:r>
     </w:p>
@@ -3732,15 +3634,6 @@
         <w:pStyle w:val="Heading2"/>
       </w:pPr>
       <w:r>
-        <w:rPr>
-          <w:rStyle w:val="SectionNumber"/>
-        </w:rPr>
-        <w:t xml:space="preserve">4.4</w:t>
-      </w:r>
-      <w:r>
-        <w:tab/>
-      </w:r>
-      <w:r>
         <w:t xml:space="preserve">3.4 Semi-Annual Activities</w:t>
       </w:r>
     </w:p>
@@ -3919,15 +3812,6 @@
         <w:pStyle w:val="Heading2"/>
       </w:pPr>
       <w:r>
-        <w:rPr>
-          <w:rStyle w:val="SectionNumber"/>
-        </w:rPr>
-        <w:t xml:space="preserve">4.5</w:t>
-      </w:r>
-      <w:r>
-        <w:tab/>
-      </w:r>
-      <w:r>
         <w:t xml:space="preserve">3.5 Annual Activities</w:t>
       </w:r>
     </w:p>
@@ -4220,15 +4104,6 @@
         <w:pStyle w:val="Heading2"/>
       </w:pPr>
       <w:r>
-        <w:rPr>
-          <w:rStyle w:val="SectionNumber"/>
-        </w:rPr>
-        <w:t xml:space="preserve">4.6</w:t>
-      </w:r>
-      <w:r>
-        <w:tab/>
-      </w:r>
-      <w:r>
         <w:t xml:space="preserve">3.6 Trend Analysis (CA-7(3))</w:t>
       </w:r>
     </w:p>
@@ -4376,15 +4251,6 @@
         <w:pStyle w:val="Heading1"/>
       </w:pPr>
       <w:r>
-        <w:rPr>
-          <w:rStyle w:val="SectionNumber"/>
-        </w:rPr>
-        <w:t xml:space="preserve">5</w:t>
-      </w:r>
-      <w:r>
-        <w:tab/>
-      </w:r>
-      <w:r>
         <w:t xml:space="preserve">4 FedRAMP 20x Authorization Package (CA-6)</w:t>
       </w:r>
     </w:p>
@@ -4393,15 +4259,6 @@
       <w:pPr>
         <w:pStyle w:val="Heading2"/>
       </w:pPr>
-      <w:r>
-        <w:rPr>
-          <w:rStyle w:val="SectionNumber"/>
-        </w:rPr>
-        <w:t xml:space="preserve">5.1</w:t>
-      </w:r>
-      <w:r>
-        <w:tab/>
-      </w:r>
       <w:r>
         <w:t xml:space="preserve">4.1 Package Components</w:t>
       </w:r>
@@ -4789,15 +4646,6 @@
         <w:pStyle w:val="Heading2"/>
       </w:pPr>
       <w:r>
-        <w:rPr>
-          <w:rStyle w:val="SectionNumber"/>
-        </w:rPr>
-        <w:t xml:space="preserve">5.2</w:t>
-      </w:r>
-      <w:r>
-        <w:tab/>
-      </w:r>
-      <w:r>
         <w:t xml:space="preserve">4.2 Submission Timeline</w:t>
       </w:r>
     </w:p>
@@ -5107,15 +4955,6 @@
         <w:pStyle w:val="Heading2"/>
       </w:pPr>
       <w:r>
-        <w:rPr>
-          <w:rStyle w:val="SectionNumber"/>
-        </w:rPr>
-        <w:t xml:space="preserve">5.3</w:t>
-      </w:r>
-      <w:r>
-        <w:tab/>
-      </w:r>
-      <w:r>
         <w:t xml:space="preserve">4.3 Authorizing Official Package Review Checklist</w:t>
       </w:r>
     </w:p>
@@ -5136,7 +4975,7 @@
         <w:pStyle w:val="Compact"/>
       </w:pPr>
       <w:r>
-        <w:t xml:space="preserve">☐ All 29 KSIs satisfied in current AR (zero open risks)</w:t>
+        <w:t xml:space="preserve">☐ All 29 KSIs self-assessed as satisfied in current AR (zero open risks); 3PAO validation scheduled</w:t>
       </w:r>
     </w:p>
     <w:p>
@@ -5250,15 +5089,6 @@
         <w:pStyle w:val="Heading1"/>
       </w:pPr>
       <w:r>
-        <w:rPr>
-          <w:rStyle w:val="SectionNumber"/>
-        </w:rPr>
-        <w:t xml:space="preserve">6</w:t>
-      </w:r>
-      <w:r>
-        <w:tab/>
-      </w:r>
-      <w:r>
         <w:t xml:space="preserve">5 BOD 26-04 VDR/VER Submission (SR-11, SA-15)</w:t>
       </w:r>
     </w:p>
@@ -5267,15 +5097,6 @@
       <w:pPr>
         <w:pStyle w:val="Heading2"/>
       </w:pPr>
-      <w:r>
-        <w:rPr>
-          <w:rStyle w:val="SectionNumber"/>
-        </w:rPr>
-        <w:t xml:space="preserve">6.1</w:t>
-      </w:r>
-      <w:r>
-        <w:tab/>
-      </w:r>
       <w:r>
         <w:t xml:space="preserve">5.1 BOD 26-04 Overview</w:t>
       </w:r>
@@ -5397,15 +5218,6 @@
         <w:pStyle w:val="Heading2"/>
       </w:pPr>
       <w:r>
-        <w:rPr>
-          <w:rStyle w:val="SectionNumber"/>
-        </w:rPr>
-        <w:t xml:space="preserve">6.2</w:t>
-      </w:r>
-      <w:r>
-        <w:tab/>
-      </w:r>
-      <w:r>
         <w:t xml:space="preserve">5.2 SBOM Artifact Chain</w:t>
       </w:r>
     </w:p>
@@ -5487,15 +5299,6 @@
       <w:pPr>
         <w:pStyle w:val="Heading3"/>
       </w:pPr>
-      <w:r>
-        <w:rPr>
-          <w:rStyle w:val="SectionNumber"/>
-        </w:rPr>
-        <w:t xml:space="preserve">6.2.1</w:t>
-      </w:r>
-      <w:r>
-        <w:tab/>
-      </w:r>
       <w:r>
         <w:t xml:space="preserve">5.2.1 Running the SBOM Pipeline</w:t>
       </w:r>
@@ -5961,15 +5764,6 @@
       <w:pPr>
         <w:pStyle w:val="Heading3"/>
       </w:pPr>
-      <w:r>
-        <w:rPr>
-          <w:rStyle w:val="SectionNumber"/>
-        </w:rPr>
-        <w:t xml:space="preserve">6.2.2</w:t>
-      </w:r>
-      <w:r>
-        <w:tab/>
-      </w:r>
       <w:r>
         <w:t xml:space="preserve">5.2.2 Submission to CISA</w:t>
       </w:r>
@@ -6085,15 +5879,6 @@
         <w:pStyle w:val="Heading2"/>
       </w:pPr>
       <w:r>
-        <w:rPr>
-          <w:rStyle w:val="SectionNumber"/>
-        </w:rPr>
-        <w:t xml:space="preserve">6.3</w:t>
-      </w:r>
-      <w:r>
-        <w:tab/>
-      </w:r>
-      <w:r>
         <w:t xml:space="preserve">5.3 AT-4 Evidence Contract Submission</w:t>
       </w:r>
     </w:p>
@@ -6266,15 +6051,6 @@
         <w:pStyle w:val="Heading1"/>
       </w:pPr>
       <w:r>
-        <w:rPr>
-          <w:rStyle w:val="SectionNumber"/>
-        </w:rPr>
-        <w:t xml:space="preserve">7</w:t>
-      </w:r>
-      <w:r>
-        <w:tab/>
-      </w:r>
-      <w:r>
         <w:t xml:space="preserve">6 Post-Authorization ConMon Architecture (CA-7, SA-15)</w:t>
       </w:r>
     </w:p>
@@ -6283,15 +6059,6 @@
       <w:pPr>
         <w:pStyle w:val="Heading2"/>
       </w:pPr>
-      <w:r>
-        <w:rPr>
-          <w:rStyle w:val="SectionNumber"/>
-        </w:rPr>
-        <w:t xml:space="preserve">7.1</w:t>
-      </w:r>
-      <w:r>
-        <w:tab/>
-      </w:r>
       <w:r>
         <w:t xml:space="preserve">6.1 ConMon Data Flow</w:t>
       </w:r>
@@ -6435,15 +6202,6 @@
       <w:pPr>
         <w:pStyle w:val="Heading2"/>
       </w:pPr>
-      <w:r>
-        <w:rPr>
-          <w:rStyle w:val="SectionNumber"/>
-        </w:rPr>
-        <w:t xml:space="preserve">7.2</w:t>
-      </w:r>
-      <w:r>
-        <w:tab/>
-      </w:r>
       <w:r>
         <w:t xml:space="preserve">6.2 Evidence Freshness Rules</w:t>
       </w:r>
@@ -6830,15 +6588,6 @@
         <w:pStyle w:val="Heading2"/>
       </w:pPr>
       <w:r>
-        <w:rPr>
-          <w:rStyle w:val="SectionNumber"/>
-        </w:rPr>
-        <w:t xml:space="preserve">7.3</w:t>
-      </w:r>
-      <w:r>
-        <w:tab/>
-      </w:r>
-      <w:r>
         <w:t xml:space="preserve">6.3 Sentinel ConMon Dashboard</w:t>
       </w:r>
     </w:p>
@@ -6968,15 +6717,6 @@
       <w:pPr>
         <w:pStyle w:val="Heading2"/>
       </w:pPr>
-      <w:r>
-        <w:rPr>
-          <w:rStyle w:val="SectionNumber"/>
-        </w:rPr>
-        <w:t xml:space="preserve">7.4</w:t>
-      </w:r>
-      <w:r>
-        <w:tab/>
-      </w:r>
       <w:r>
         <w:t xml:space="preserve">6.4 Roles and Responsibilities (CA-7(1))</w:t>
       </w:r>
@@ -7238,15 +6978,6 @@
         <w:pStyle w:val="Heading1"/>
       </w:pPr>
       <w:r>
-        <w:rPr>
-          <w:rStyle w:val="SectionNumber"/>
-        </w:rPr>
-        <w:t xml:space="preserve">8</w:t>
-      </w:r>
-      <w:r>
-        <w:tab/>
-      </w:r>
-      <w:r>
         <w:t xml:space="preserve">7 Risk Assessment Integration (RA-3)</w:t>
       </w:r>
     </w:p>
@@ -7255,15 +6986,6 @@
       <w:pPr>
         <w:pStyle w:val="Heading2"/>
       </w:pPr>
-      <w:r>
-        <w:rPr>
-          <w:rStyle w:val="SectionNumber"/>
-        </w:rPr>
-        <w:t xml:space="preserve">8.1</w:t>
-      </w:r>
-      <w:r>
-        <w:tab/>
-      </w:r>
       <w:r>
         <w:t xml:space="preserve">7.1 Risk Register Structure</w:t>
       </w:r>
@@ -7519,15 +7241,6 @@
         <w:pStyle w:val="Heading2"/>
       </w:pPr>
       <w:r>
-        <w:rPr>
-          <w:rStyle w:val="SectionNumber"/>
-        </w:rPr>
-        <w:t xml:space="preserve">8.2</w:t>
-      </w:r>
-      <w:r>
-        <w:tab/>
-      </w:r>
-      <w:r>
         <w:t xml:space="preserve">7.2 Residual Risks Not Covered by KSI Evaluation</w:t>
       </w:r>
     </w:p>
@@ -7654,15 +7367,6 @@
         <w:pStyle w:val="Heading1"/>
       </w:pPr>
       <w:r>
-        <w:rPr>
-          <w:rStyle w:val="SectionNumber"/>
-        </w:rPr>
-        <w:t xml:space="preserve">9</w:t>
-      </w:r>
-      <w:r>
-        <w:tab/>
-      </w:r>
-      <w:r>
         <w:t xml:space="preserve">8 Authorization Package Assembly Checklist</w:t>
       </w:r>
     </w:p>
@@ -7685,15 +7389,6 @@
       <w:pPr>
         <w:pStyle w:val="Heading2"/>
       </w:pPr>
-      <w:r>
-        <w:rPr>
-          <w:rStyle w:val="SectionNumber"/>
-        </w:rPr>
-        <w:t xml:space="preserve">9.1</w:t>
-      </w:r>
-      <w:r>
-        <w:tab/>
-      </w:r>
       <w:r>
         <w:t xml:space="preserve">8.1 Pre-Submission Checklist</w:t>
       </w:r>
@@ -8135,15 +7830,6 @@
         <w:pStyle w:val="Heading2"/>
       </w:pPr>
       <w:r>
-        <w:rPr>
-          <w:rStyle w:val="SectionNumber"/>
-        </w:rPr>
-        <w:t xml:space="preserve">9.2</w:t>
-      </w:r>
-      <w:r>
-        <w:tab/>
-      </w:r>
-      <w:r>
         <w:t xml:space="preserve">8.2 Day-of-Submission Procedure</w:t>
       </w:r>
     </w:p>
@@ -8544,15 +8230,6 @@
       <w:pPr>
         <w:pStyle w:val="Heading1"/>
       </w:pPr>
-      <w:r>
-        <w:rPr>
-          <w:rStyle w:val="SectionNumber"/>
-        </w:rPr>
-        <w:t xml:space="preserve">10</w:t>
-      </w:r>
-      <w:r>
-        <w:tab/>
-      </w:r>
       <w:r>
         <w:t xml:space="preserve">9 Controls Closed by This Document</w:t>
       </w:r>
@@ -9045,15 +8722,6 @@
         <w:pStyle w:val="Heading1"/>
       </w:pPr>
       <w:r>
-        <w:rPr>
-          <w:rStyle w:val="SectionNumber"/>
-        </w:rPr>
-        <w:t xml:space="preserve">11</w:t>
-      </w:r>
-      <w:r>
-        <w:tab/>
-      </w:r>
-      <w:r>
         <w:t xml:space="preserve">Appendix A — OSCAL AR Findings Summary</w:t>
       </w:r>
     </w:p>
@@ -9068,7 +8736,7 @@
         <w:t xml:space="preserve"> </w:t>
       </w:r>
       <w:r>
-        <w:t xml:space="preserve">run. All 29 are satisfied.</w:t>
+        <w:t xml:space="preserve">run (self-assessment). All 29 are evaluated as satisfied pending 3PAO validation.</w:t>
       </w:r>
     </w:p>
     <w:p>
@@ -10659,9 +10327,7 @@
       </w:r>
     </w:p>
     <w:bookmarkEnd w:id="65"/>
-    <w:sectPr>
-      <w:pgMar w:top="720" w:right="720" w:bottom="720" w:left="720" w:header="720" w:footer="720" w:gutter="0"/>
-    </w:sectPr>
+    <w:sectPr/>
   </w:body>
 </w:document>
 </file>

</xml_diff>